<commit_message>
Update draft email for 2026-2027 class schedules with campus links and consistency questions; remove temporary files.
</commit_message>
<xml_diff>
--- a/Schedule_Questions_Email_Draft_edit.docx
+++ b/Schedule_Questions_Email_Draft_edit.docx
@@ -30,39 +30,26 @@
         <w:spacing w:after="160"/>
       </w:pPr>
       <w:r>
-        <w:t xml:space="preserve">I’m </w:t>
-      </w:r>
-      <w:proofErr w:type="gramStart"/>
-      <w:r>
-        <w:t>finalizing</w:t>
-      </w:r>
-      <w:proofErr w:type="gramEnd"/>
-      <w:r>
-        <w:t xml:space="preserve"> the 2026-2027 class </w:t>
-      </w:r>
-      <w:proofErr w:type="gramStart"/>
-      <w:r>
-        <w:t>schedule pages</w:t>
-      </w:r>
-      <w:proofErr w:type="gramEnd"/>
-      <w:r>
-        <w:t xml:space="preserve"> for both PTC campuses on the </w:t>
-      </w:r>
-      <w:proofErr w:type="gramStart"/>
-      <w:r>
-        <w:t>website</w:t>
-      </w:r>
-      <w:proofErr w:type="gramEnd"/>
-      <w:r>
-        <w:t xml:space="preserve"> and I want to make sure what we publish is accurate before it goes live. A few things came up when I was comparing the St. Petersburg schedule to the Clearwater one side by side.</w:t>
+        <w:t>Here are the Campus Schedule temporary links:</w:t>
       </w:r>
     </w:p>
     <w:p>
       <w:pPr>
-        <w:pStyle w:val="Heading2"/>
-      </w:pPr>
-      <w:r>
-        <w:t>Adult Education and Apprenticeships</w:t>
+        <w:spacing w:after="160"/>
+      </w:pPr>
+      <w:r>
+        <w:t xml:space="preserve">Clearwater: </w:t>
+      </w:r>
+      <w:hyperlink r:id="rId5" w:history="1">
+        <w:r>
+          <w:rPr>
+            <w:rStyle w:val="Hyperlink"/>
+          </w:rPr>
+          <w:t>https://shafferma08.github.io/ptc-finalsite/schedule-clearwater.html</w:t>
+        </w:r>
+      </w:hyperlink>
+      <w:r>
+        <w:t xml:space="preserve"> </w:t>
       </w:r>
     </w:p>
     <w:p>
@@ -70,7 +57,18 @@
         <w:spacing w:after="160"/>
       </w:pPr>
       <w:r>
-        <w:t>The Clearwater page lists ABE/GED, ESOL, and a full roster of apprenticeships. The St. Pete PDF didn’t include any of these.</w:t>
+        <w:t xml:space="preserve">St. Pete: </w:t>
+      </w:r>
+      <w:hyperlink r:id="rId6" w:history="1">
+        <w:r>
+          <w:rPr>
+            <w:rStyle w:val="Hyperlink"/>
+          </w:rPr>
+          <w:t>https://shafferma08.github.io/ptc-finalsite/schedule-stpete.html</w:t>
+        </w:r>
+      </w:hyperlink>
+      <w:r>
+        <w:t xml:space="preserve"> </w:t>
       </w:r>
     </w:p>
     <w:p>
@@ -78,7 +76,7 @@
         <w:spacing w:after="160"/>
       </w:pPr>
       <w:r>
-        <w:t xml:space="preserve">Does St. Pete offer any adult education or apprenticeship programs? </w:t>
+        <w:t>A few things came up when I was comparing the St. Petersburg schedule to the Clearwater one side by side.</w:t>
       </w:r>
     </w:p>
     <w:p>
@@ -86,7 +84,7 @@
         <w:pStyle w:val="Heading2"/>
       </w:pPr>
       <w:r>
-        <w:t>Formatting question</w:t>
+        <w:t>Adult Education and Apprenticeships</w:t>
       </w:r>
     </w:p>
     <w:p>
@@ -94,13 +92,48 @@
         <w:spacing w:after="160"/>
       </w:pPr>
       <w:r>
-        <w:t>The Clearwater schedule is roughly alphabetical within each category (Full-Time, Adult Ed, Apprenticeships). The St. Pete PDF is grouped by career cluster instead. For consistency between the two pages, I’d like to put St. Pete in alphabetical order too unless there’s a reason the cluster grouping is preferred.</w:t>
+        <w:t>The Clearwater page lists ABE/GED, ESOL, and a full roster of apprenticeships. The St. Pete PDF didn’t include any of these.</w:t>
       </w:r>
     </w:p>
     <w:p>
       <w:pPr>
         <w:spacing w:after="160"/>
       </w:pPr>
+      <w:r>
+        <w:t xml:space="preserve">Does St. Pete offer any adult education or apprenticeship programs? </w:t>
+      </w:r>
+    </w:p>
+    <w:p>
+      <w:pPr>
+        <w:pStyle w:val="Heading2"/>
+      </w:pPr>
+      <w:r>
+        <w:t>Start dates</w:t>
+      </w:r>
+    </w:p>
+    <w:p>
+      <w:pPr>
+        <w:spacing w:after="160"/>
+      </w:pPr>
+      <w:r>
+        <w:t>The St. Pete schedule lists start dates by term number (1, 2, 3, 4, 5). The Clearwater schedule currently shows “TBD – 2026/27” as a placeholder. Should we use term numbers on both pages for consistency?</w:t>
+      </w:r>
+    </w:p>
+    <w:p>
+      <w:pPr>
+        <w:pStyle w:val="Heading2"/>
+      </w:pPr>
+      <w:r>
+        <w:t>Ordering</w:t>
+      </w:r>
+    </w:p>
+    <w:p>
+      <w:pPr>
+        <w:spacing w:after="160"/>
+      </w:pPr>
+      <w:r>
+        <w:t>Should the St. Petersburg list be alphabetized like Clearwater’s?</w:t>
+      </w:r>
     </w:p>
     <w:sectPr>
       <w:pgSz w:w="12240" w:h="15840"/>
@@ -808,7 +841,6 @@
   <w:style w:type="character" w:default="1" w:styleId="DefaultParagraphFont">
     <w:name w:val="Default Paragraph Font"/>
     <w:uiPriority w:val="1"/>
-    <w:semiHidden/>
     <w:unhideWhenUsed/>
   </w:style>
   <w:style w:type="table" w:default="1" w:styleId="TableNormal">
@@ -922,6 +954,18 @@
     <w:rPr>
       <w:sz w:val="20"/>
       <w:szCs w:val="20"/>
+    </w:rPr>
+  </w:style>
+  <w:style w:type="character" w:styleId="UnresolvedMention">
+    <w:name w:val="Unresolved Mention"/>
+    <w:basedOn w:val="DefaultParagraphFont"/>
+    <w:uiPriority w:val="99"/>
+    <w:semiHidden/>
+    <w:unhideWhenUsed/>
+    <w:rsid w:val="003F7705"/>
+    <w:rPr>
+      <w:color w:val="605E5C"/>
+      <w:shd w:val="clear" w:color="auto" w:fill="E1DFDD"/>
     </w:rPr>
   </w:style>
 </w:styles>

</xml_diff>